<commit_message>
file upload. location.html created
</commit_message>
<xml_diff>
--- a/v2/Green DVD LIST.docx
+++ b/v2/Green DVD LIST.docx
@@ -12,26 +12,6 @@
           <w:szCs w:val="20"/>
         </w:rPr>
       </w:pPr>
-    </w:p>
-    <w:p>
-      <w:pPr>
-        <w:spacing w:line="480" w:lineRule="auto"/>
-        <w:rPr>
-          <w:rFonts w:ascii="Arial" w:eastAsia="Arial" w:hAnsi="Arial" w:cs="Arial"/>
-          <w:b/>
-          <w:sz w:val="20"/>
-          <w:szCs w:val="20"/>
-        </w:rPr>
-      </w:pPr>
-      <w:r>
-        <w:rPr>
-          <w:rFonts w:ascii="Arial" w:eastAsia="Arial" w:hAnsi="Arial" w:cs="Arial"/>
-          <w:b/>
-          <w:sz w:val="20"/>
-          <w:szCs w:val="20"/>
-        </w:rPr>
-        <w:t>Green DVD’s</w:t>
-      </w:r>
     </w:p>
     <w:p>
       <w:pPr>
@@ -763,7 +743,6 @@
           <w:sz w:val="20"/>
           <w:szCs w:val="20"/>
         </w:rPr>
-        <w:lastRenderedPageBreak/>
         <w:t>29.</w:t>
       </w:r>
       <w:r>
@@ -876,6 +855,7 @@
           <w:sz w:val="20"/>
           <w:szCs w:val="20"/>
         </w:rPr>
+        <w:lastRenderedPageBreak/>
         <w:t>32.  Adventures on the RED PLANE</w:t>
       </w:r>
       <w:r>
@@ -1554,67 +1534,67 @@
           <w:sz w:val="20"/>
           <w:szCs w:val="20"/>
         </w:rPr>
+        <w:t>61. LOOPY DELOOP Disc 2</w:t>
+      </w:r>
+    </w:p>
+    <w:p>
+      <w:pPr>
+        <w:spacing w:line="480" w:lineRule="auto"/>
+        <w:rPr>
+          <w:rFonts w:ascii="Arial" w:eastAsia="Arial" w:hAnsi="Arial" w:cs="Arial"/>
+          <w:b/>
+          <w:sz w:val="20"/>
+          <w:szCs w:val="20"/>
+        </w:rPr>
+      </w:pPr>
+      <w:r>
+        <w:rPr>
+          <w:rFonts w:ascii="Arial" w:eastAsia="Arial" w:hAnsi="Arial" w:cs="Arial"/>
+          <w:b/>
+          <w:sz w:val="20"/>
+          <w:szCs w:val="20"/>
+        </w:rPr>
+        <w:t>62. JABBERJAW Disc 1</w:t>
+      </w:r>
+    </w:p>
+    <w:p>
+      <w:pPr>
+        <w:spacing w:line="480" w:lineRule="auto"/>
+        <w:rPr>
+          <w:rFonts w:ascii="Arial" w:eastAsia="Arial" w:hAnsi="Arial" w:cs="Arial"/>
+          <w:b/>
+          <w:sz w:val="20"/>
+          <w:szCs w:val="20"/>
+        </w:rPr>
+      </w:pPr>
+      <w:r>
+        <w:rPr>
+          <w:rFonts w:ascii="Arial" w:eastAsia="Arial" w:hAnsi="Arial" w:cs="Arial"/>
+          <w:b/>
+          <w:sz w:val="20"/>
+          <w:szCs w:val="20"/>
+        </w:rPr>
+        <w:t>63. JABBERJAW Disc 2</w:t>
+      </w:r>
+    </w:p>
+    <w:p>
+      <w:pPr>
+        <w:spacing w:line="480" w:lineRule="auto"/>
+        <w:rPr>
+          <w:rFonts w:ascii="Arial" w:eastAsia="Arial" w:hAnsi="Arial" w:cs="Arial"/>
+          <w:b/>
+          <w:sz w:val="20"/>
+          <w:szCs w:val="20"/>
+        </w:rPr>
+      </w:pPr>
+      <w:r>
+        <w:rPr>
+          <w:rFonts w:ascii="Arial" w:eastAsia="Arial" w:hAnsi="Arial" w:cs="Arial"/>
+          <w:b/>
+          <w:sz w:val="20"/>
+          <w:szCs w:val="20"/>
+        </w:rPr>
         <w:lastRenderedPageBreak/>
-        <w:t>61. LOOPY DELOOP Disc 2</w:t>
-      </w:r>
-    </w:p>
-    <w:p>
-      <w:pPr>
-        <w:spacing w:line="480" w:lineRule="auto"/>
-        <w:rPr>
-          <w:rFonts w:ascii="Arial" w:eastAsia="Arial" w:hAnsi="Arial" w:cs="Arial"/>
-          <w:b/>
-          <w:sz w:val="20"/>
-          <w:szCs w:val="20"/>
-        </w:rPr>
-      </w:pPr>
-      <w:r>
-        <w:rPr>
-          <w:rFonts w:ascii="Arial" w:eastAsia="Arial" w:hAnsi="Arial" w:cs="Arial"/>
-          <w:b/>
-          <w:sz w:val="20"/>
-          <w:szCs w:val="20"/>
-        </w:rPr>
-        <w:t>62. JABBERJAW Disc 1</w:t>
-      </w:r>
-    </w:p>
-    <w:p>
-      <w:pPr>
-        <w:spacing w:line="480" w:lineRule="auto"/>
-        <w:rPr>
-          <w:rFonts w:ascii="Arial" w:eastAsia="Arial" w:hAnsi="Arial" w:cs="Arial"/>
-          <w:b/>
-          <w:sz w:val="20"/>
-          <w:szCs w:val="20"/>
-        </w:rPr>
-      </w:pPr>
-      <w:r>
-        <w:rPr>
-          <w:rFonts w:ascii="Arial" w:eastAsia="Arial" w:hAnsi="Arial" w:cs="Arial"/>
-          <w:b/>
-          <w:sz w:val="20"/>
-          <w:szCs w:val="20"/>
-        </w:rPr>
-        <w:t>63. JABBERJAW Disc 2</w:t>
-      </w:r>
-    </w:p>
-    <w:p>
-      <w:pPr>
-        <w:spacing w:line="480" w:lineRule="auto"/>
-        <w:rPr>
-          <w:rFonts w:ascii="Arial" w:eastAsia="Arial" w:hAnsi="Arial" w:cs="Arial"/>
-          <w:b/>
-          <w:sz w:val="20"/>
-          <w:szCs w:val="20"/>
-        </w:rPr>
-      </w:pPr>
-      <w:r>
-        <w:rPr>
-          <w:rFonts w:ascii="Arial" w:eastAsia="Arial" w:hAnsi="Arial" w:cs="Arial"/>
-          <w:b/>
-          <w:sz w:val="20"/>
-          <w:szCs w:val="20"/>
-        </w:rPr>
         <w:t>64. JABBERJAW Disc 3</w:t>
       </w:r>
     </w:p>
@@ -2195,7 +2175,6 @@
           <w:sz w:val="20"/>
           <w:szCs w:val="20"/>
         </w:rPr>
-        <w:lastRenderedPageBreak/>
         <w:t>89. JUSTICE LEAGUE Disc 2</w:t>
       </w:r>
     </w:p>
@@ -2266,6 +2245,7 @@
           <w:sz w:val="20"/>
           <w:szCs w:val="20"/>
         </w:rPr>
+        <w:lastRenderedPageBreak/>
         <w:t>92. THE HUCKLEBERRY HOUND SHOW Disc 1</w:t>
       </w:r>
     </w:p>
@@ -2846,67 +2826,67 @@
           <w:sz w:val="20"/>
           <w:szCs w:val="20"/>
         </w:rPr>
+        <w:t>121. DUCKMAN Disc 9</w:t>
+      </w:r>
+    </w:p>
+    <w:p>
+      <w:pPr>
+        <w:spacing w:line="480" w:lineRule="auto"/>
+        <w:rPr>
+          <w:rFonts w:ascii="Arial" w:eastAsia="Arial" w:hAnsi="Arial" w:cs="Arial"/>
+          <w:b/>
+          <w:sz w:val="20"/>
+          <w:szCs w:val="20"/>
+        </w:rPr>
+      </w:pPr>
+      <w:r>
+        <w:rPr>
+          <w:rFonts w:ascii="Arial" w:eastAsia="Arial" w:hAnsi="Arial" w:cs="Arial"/>
+          <w:b/>
+          <w:sz w:val="20"/>
+          <w:szCs w:val="20"/>
+        </w:rPr>
+        <w:t>122. DUCKMAN Disc 10</w:t>
+      </w:r>
+    </w:p>
+    <w:p>
+      <w:pPr>
+        <w:spacing w:line="480" w:lineRule="auto"/>
+        <w:rPr>
+          <w:rFonts w:ascii="Arial" w:eastAsia="Arial" w:hAnsi="Arial" w:cs="Arial"/>
+          <w:b/>
+          <w:sz w:val="20"/>
+          <w:szCs w:val="20"/>
+        </w:rPr>
+      </w:pPr>
+      <w:r>
+        <w:rPr>
+          <w:rFonts w:ascii="Arial" w:eastAsia="Arial" w:hAnsi="Arial" w:cs="Arial"/>
+          <w:b/>
+          <w:sz w:val="20"/>
+          <w:szCs w:val="20"/>
+        </w:rPr>
+        <w:t>123. AVENGERS CONFIDENTIAL Disc 1</w:t>
+      </w:r>
+    </w:p>
+    <w:p>
+      <w:pPr>
+        <w:spacing w:line="480" w:lineRule="auto"/>
+        <w:rPr>
+          <w:rFonts w:ascii="Arial" w:eastAsia="Arial" w:hAnsi="Arial" w:cs="Arial"/>
+          <w:b/>
+          <w:sz w:val="20"/>
+          <w:szCs w:val="20"/>
+        </w:rPr>
+      </w:pPr>
+      <w:r>
+        <w:rPr>
+          <w:rFonts w:ascii="Arial" w:eastAsia="Arial" w:hAnsi="Arial" w:cs="Arial"/>
+          <w:b/>
+          <w:sz w:val="20"/>
+          <w:szCs w:val="20"/>
+        </w:rPr>
         <w:lastRenderedPageBreak/>
-        <w:t>121. DUCKMAN Disc 9</w:t>
-      </w:r>
-    </w:p>
-    <w:p>
-      <w:pPr>
-        <w:spacing w:line="480" w:lineRule="auto"/>
-        <w:rPr>
-          <w:rFonts w:ascii="Arial" w:eastAsia="Arial" w:hAnsi="Arial" w:cs="Arial"/>
-          <w:b/>
-          <w:sz w:val="20"/>
-          <w:szCs w:val="20"/>
-        </w:rPr>
-      </w:pPr>
-      <w:r>
-        <w:rPr>
-          <w:rFonts w:ascii="Arial" w:eastAsia="Arial" w:hAnsi="Arial" w:cs="Arial"/>
-          <w:b/>
-          <w:sz w:val="20"/>
-          <w:szCs w:val="20"/>
-        </w:rPr>
-        <w:t>122. DUCKMAN Disc 10</w:t>
-      </w:r>
-    </w:p>
-    <w:p>
-      <w:pPr>
-        <w:spacing w:line="480" w:lineRule="auto"/>
-        <w:rPr>
-          <w:rFonts w:ascii="Arial" w:eastAsia="Arial" w:hAnsi="Arial" w:cs="Arial"/>
-          <w:b/>
-          <w:sz w:val="20"/>
-          <w:szCs w:val="20"/>
-        </w:rPr>
-      </w:pPr>
-      <w:r>
-        <w:rPr>
-          <w:rFonts w:ascii="Arial" w:eastAsia="Arial" w:hAnsi="Arial" w:cs="Arial"/>
-          <w:b/>
-          <w:sz w:val="20"/>
-          <w:szCs w:val="20"/>
-        </w:rPr>
-        <w:t>123. AVENGERS CONFIDENTIAL Disc 1</w:t>
-      </w:r>
-    </w:p>
-    <w:p>
-      <w:pPr>
-        <w:spacing w:line="480" w:lineRule="auto"/>
-        <w:rPr>
-          <w:rFonts w:ascii="Arial" w:eastAsia="Arial" w:hAnsi="Arial" w:cs="Arial"/>
-          <w:b/>
-          <w:sz w:val="20"/>
-          <w:szCs w:val="20"/>
-        </w:rPr>
-      </w:pPr>
-      <w:r>
-        <w:rPr>
-          <w:rFonts w:ascii="Arial" w:eastAsia="Arial" w:hAnsi="Arial" w:cs="Arial"/>
-          <w:b/>
-          <w:sz w:val="20"/>
-          <w:szCs w:val="20"/>
-        </w:rPr>
         <w:t>124. THOR Disc 1</w:t>
       </w:r>
     </w:p>
@@ -3247,15 +3227,6 @@
           <w:szCs w:val="20"/>
         </w:rPr>
         <w:br/>
-      </w:r>
-      <w:r>
-        <w:rPr>
-          <w:rFonts w:ascii="Arial" w:eastAsia="Arial" w:hAnsi="Arial" w:cs="Arial"/>
-          <w:b/>
-          <w:sz w:val="20"/>
-          <w:szCs w:val="20"/>
-        </w:rPr>
-        <w:lastRenderedPageBreak/>
         <w:t>153. Geronimo Stilton  Vol 2</w:t>
       </w:r>
       <w:r>
@@ -3276,6 +3247,15 @@
           <w:szCs w:val="20"/>
         </w:rPr>
         <w:br/>
+      </w:r>
+      <w:r>
+        <w:rPr>
+          <w:rFonts w:ascii="Arial" w:eastAsia="Arial" w:hAnsi="Arial" w:cs="Arial"/>
+          <w:b/>
+          <w:sz w:val="20"/>
+          <w:szCs w:val="20"/>
+        </w:rPr>
+        <w:lastRenderedPageBreak/>
         <w:t>155. PETER PAN</w:t>
       </w:r>
       <w:r>
@@ -3775,47 +3755,47 @@
           <w:sz w:val="20"/>
           <w:szCs w:val="20"/>
         </w:rPr>
+        <w:t>180. COCO</w:t>
+      </w:r>
+    </w:p>
+    <w:p>
+      <w:pPr>
+        <w:spacing w:line="480" w:lineRule="auto"/>
+        <w:rPr>
+          <w:rFonts w:ascii="Arial" w:eastAsia="Arial" w:hAnsi="Arial" w:cs="Arial"/>
+          <w:b/>
+          <w:sz w:val="20"/>
+          <w:szCs w:val="20"/>
+        </w:rPr>
+      </w:pPr>
+      <w:r>
+        <w:rPr>
+          <w:rFonts w:ascii="Arial" w:eastAsia="Arial" w:hAnsi="Arial" w:cs="Arial"/>
+          <w:b/>
+          <w:sz w:val="20"/>
+          <w:szCs w:val="20"/>
+        </w:rPr>
+        <w:t>181. TOY STORY 4</w:t>
+      </w:r>
+    </w:p>
+    <w:p>
+      <w:pPr>
+        <w:spacing w:line="480" w:lineRule="auto"/>
+        <w:rPr>
+          <w:rFonts w:ascii="Arial" w:eastAsia="Arial" w:hAnsi="Arial" w:cs="Arial"/>
+          <w:b/>
+          <w:sz w:val="20"/>
+          <w:szCs w:val="20"/>
+        </w:rPr>
+      </w:pPr>
+      <w:r>
+        <w:rPr>
+          <w:rFonts w:ascii="Arial" w:eastAsia="Arial" w:hAnsi="Arial" w:cs="Arial"/>
+          <w:b/>
+          <w:sz w:val="20"/>
+          <w:szCs w:val="20"/>
+        </w:rPr>
         <w:lastRenderedPageBreak/>
-        <w:t>180. COCO</w:t>
-      </w:r>
-    </w:p>
-    <w:p>
-      <w:pPr>
-        <w:spacing w:line="480" w:lineRule="auto"/>
-        <w:rPr>
-          <w:rFonts w:ascii="Arial" w:eastAsia="Arial" w:hAnsi="Arial" w:cs="Arial"/>
-          <w:b/>
-          <w:sz w:val="20"/>
-          <w:szCs w:val="20"/>
-        </w:rPr>
-      </w:pPr>
-      <w:r>
-        <w:rPr>
-          <w:rFonts w:ascii="Arial" w:eastAsia="Arial" w:hAnsi="Arial" w:cs="Arial"/>
-          <w:b/>
-          <w:sz w:val="20"/>
-          <w:szCs w:val="20"/>
-        </w:rPr>
-        <w:t>181. TOY STORY 4</w:t>
-      </w:r>
-    </w:p>
-    <w:p>
-      <w:pPr>
-        <w:spacing w:line="480" w:lineRule="auto"/>
-        <w:rPr>
-          <w:rFonts w:ascii="Arial" w:eastAsia="Arial" w:hAnsi="Arial" w:cs="Arial"/>
-          <w:b/>
-          <w:sz w:val="20"/>
-          <w:szCs w:val="20"/>
-        </w:rPr>
-      </w:pPr>
-      <w:r>
-        <w:rPr>
-          <w:rFonts w:ascii="Arial" w:eastAsia="Arial" w:hAnsi="Arial" w:cs="Arial"/>
-          <w:b/>
-          <w:sz w:val="20"/>
-          <w:szCs w:val="20"/>
-        </w:rPr>
         <w:t>182. GARFIELD &amp; Cie</w:t>
       </w:r>
     </w:p>
@@ -4388,7 +4368,6 @@
           <w:sz w:val="20"/>
           <w:szCs w:val="20"/>
         </w:rPr>
-        <w:lastRenderedPageBreak/>
         <w:t>211. THE Treacle People</w:t>
       </w:r>
       <w:r>
@@ -4419,6 +4398,7 @@
           <w:sz w:val="20"/>
           <w:szCs w:val="20"/>
         </w:rPr>
+        <w:lastRenderedPageBreak/>
         <w:t>213. CARTOON Fairy Tales</w:t>
       </w:r>
     </w:p>
@@ -4959,15 +4939,6 @@
           <w:szCs w:val="20"/>
         </w:rPr>
         <w:br/>
-      </w:r>
-      <w:r>
-        <w:rPr>
-          <w:rFonts w:ascii="Arial" w:eastAsia="Arial" w:hAnsi="Arial" w:cs="Arial"/>
-          <w:b/>
-          <w:sz w:val="20"/>
-          <w:szCs w:val="20"/>
-        </w:rPr>
-        <w:lastRenderedPageBreak/>
         <w:t>240.  DRAGONBALL Collection 3 Disc 2</w:t>
       </w:r>
       <w:r>
@@ -4998,6 +4969,7 @@
           <w:sz w:val="20"/>
           <w:szCs w:val="20"/>
         </w:rPr>
+        <w:lastRenderedPageBreak/>
         <w:t>242.  DRAGONBALL Collection 4 Disc 2</w:t>
       </w:r>
     </w:p>
@@ -5526,47 +5498,47 @@
           <w:sz w:val="20"/>
           <w:szCs w:val="20"/>
         </w:rPr>
+        <w:t>272. Bambaloo Box Set 3 Disc 2</w:t>
+      </w:r>
+    </w:p>
+    <w:p>
+      <w:pPr>
+        <w:spacing w:line="480" w:lineRule="auto"/>
+        <w:rPr>
+          <w:rFonts w:ascii="Arial" w:eastAsia="Arial" w:hAnsi="Arial" w:cs="Arial"/>
+          <w:b/>
+          <w:sz w:val="20"/>
+          <w:szCs w:val="20"/>
+        </w:rPr>
+      </w:pPr>
+      <w:r>
+        <w:rPr>
+          <w:rFonts w:ascii="Arial" w:eastAsia="Arial" w:hAnsi="Arial" w:cs="Arial"/>
+          <w:b/>
+          <w:sz w:val="20"/>
+          <w:szCs w:val="20"/>
+        </w:rPr>
+        <w:t>273. Bambaloo Box Set 3 Disc 3</w:t>
+      </w:r>
+    </w:p>
+    <w:p>
+      <w:pPr>
+        <w:spacing w:line="480" w:lineRule="auto"/>
+        <w:rPr>
+          <w:rFonts w:ascii="Arial" w:eastAsia="Arial" w:hAnsi="Arial" w:cs="Arial"/>
+          <w:b/>
+          <w:sz w:val="20"/>
+          <w:szCs w:val="20"/>
+        </w:rPr>
+      </w:pPr>
+      <w:r>
+        <w:rPr>
+          <w:rFonts w:ascii="Arial" w:eastAsia="Arial" w:hAnsi="Arial" w:cs="Arial"/>
+          <w:b/>
+          <w:sz w:val="20"/>
+          <w:szCs w:val="20"/>
+        </w:rPr>
         <w:lastRenderedPageBreak/>
-        <w:t>272. Bambaloo Box Set 3 Disc 2</w:t>
-      </w:r>
-    </w:p>
-    <w:p>
-      <w:pPr>
-        <w:spacing w:line="480" w:lineRule="auto"/>
-        <w:rPr>
-          <w:rFonts w:ascii="Arial" w:eastAsia="Arial" w:hAnsi="Arial" w:cs="Arial"/>
-          <w:b/>
-          <w:sz w:val="20"/>
-          <w:szCs w:val="20"/>
-        </w:rPr>
-      </w:pPr>
-      <w:r>
-        <w:rPr>
-          <w:rFonts w:ascii="Arial" w:eastAsia="Arial" w:hAnsi="Arial" w:cs="Arial"/>
-          <w:b/>
-          <w:sz w:val="20"/>
-          <w:szCs w:val="20"/>
-        </w:rPr>
-        <w:t>273. Bambaloo Box Set 3 Disc 3</w:t>
-      </w:r>
-    </w:p>
-    <w:p>
-      <w:pPr>
-        <w:spacing w:line="480" w:lineRule="auto"/>
-        <w:rPr>
-          <w:rFonts w:ascii="Arial" w:eastAsia="Arial" w:hAnsi="Arial" w:cs="Arial"/>
-          <w:b/>
-          <w:sz w:val="20"/>
-          <w:szCs w:val="20"/>
-        </w:rPr>
-      </w:pPr>
-      <w:r>
-        <w:rPr>
-          <w:rFonts w:ascii="Arial" w:eastAsia="Arial" w:hAnsi="Arial" w:cs="Arial"/>
-          <w:b/>
-          <w:sz w:val="20"/>
-          <w:szCs w:val="20"/>
-        </w:rPr>
         <w:t>274. Pound Puppies Homeward Pound</w:t>
       </w:r>
     </w:p>
@@ -6093,47 +6065,47 @@
           <w:sz w:val="20"/>
           <w:szCs w:val="20"/>
         </w:rPr>
+        <w:t>303. SATURDAY MORNING CARTOON COLLECTION DISC 2</w:t>
+      </w:r>
+    </w:p>
+    <w:p>
+      <w:pPr>
+        <w:spacing w:line="480" w:lineRule="auto"/>
+        <w:rPr>
+          <w:rFonts w:ascii="Arial" w:eastAsia="Arial" w:hAnsi="Arial" w:cs="Arial"/>
+          <w:b/>
+          <w:sz w:val="20"/>
+          <w:szCs w:val="20"/>
+        </w:rPr>
+      </w:pPr>
+      <w:r>
+        <w:rPr>
+          <w:rFonts w:ascii="Arial" w:eastAsia="Arial" w:hAnsi="Arial" w:cs="Arial"/>
+          <w:b/>
+          <w:sz w:val="20"/>
+          <w:szCs w:val="20"/>
+        </w:rPr>
+        <w:t>304. SATURDAY MORNING CARTOON COLLECTION DISC 3</w:t>
+      </w:r>
+    </w:p>
+    <w:p>
+      <w:pPr>
+        <w:spacing w:line="480" w:lineRule="auto"/>
+        <w:rPr>
+          <w:rFonts w:ascii="Arial" w:eastAsia="Arial" w:hAnsi="Arial" w:cs="Arial"/>
+          <w:b/>
+          <w:sz w:val="20"/>
+          <w:szCs w:val="20"/>
+        </w:rPr>
+      </w:pPr>
+      <w:r>
+        <w:rPr>
+          <w:rFonts w:ascii="Arial" w:eastAsia="Arial" w:hAnsi="Arial" w:cs="Arial"/>
+          <w:b/>
+          <w:sz w:val="20"/>
+          <w:szCs w:val="20"/>
+        </w:rPr>
         <w:lastRenderedPageBreak/>
-        <w:t>303. SATURDAY MORNING CARTOON COLLECTION DISC 2</w:t>
-      </w:r>
-    </w:p>
-    <w:p>
-      <w:pPr>
-        <w:spacing w:line="480" w:lineRule="auto"/>
-        <w:rPr>
-          <w:rFonts w:ascii="Arial" w:eastAsia="Arial" w:hAnsi="Arial" w:cs="Arial"/>
-          <w:b/>
-          <w:sz w:val="20"/>
-          <w:szCs w:val="20"/>
-        </w:rPr>
-      </w:pPr>
-      <w:r>
-        <w:rPr>
-          <w:rFonts w:ascii="Arial" w:eastAsia="Arial" w:hAnsi="Arial" w:cs="Arial"/>
-          <w:b/>
-          <w:sz w:val="20"/>
-          <w:szCs w:val="20"/>
-        </w:rPr>
-        <w:t>304. SATURDAY MORNING CARTOON COLLECTION DISC 3</w:t>
-      </w:r>
-    </w:p>
-    <w:p>
-      <w:pPr>
-        <w:spacing w:line="480" w:lineRule="auto"/>
-        <w:rPr>
-          <w:rFonts w:ascii="Arial" w:eastAsia="Arial" w:hAnsi="Arial" w:cs="Arial"/>
-          <w:b/>
-          <w:sz w:val="20"/>
-          <w:szCs w:val="20"/>
-        </w:rPr>
-      </w:pPr>
-      <w:r>
-        <w:rPr>
-          <w:rFonts w:ascii="Arial" w:eastAsia="Arial" w:hAnsi="Arial" w:cs="Arial"/>
-          <w:b/>
-          <w:sz w:val="20"/>
-          <w:szCs w:val="20"/>
-        </w:rPr>
         <w:t>305. SATURDAY MORNING CARTOON COLLECTION DISC 4</w:t>
       </w:r>
     </w:p>
@@ -6743,47 +6715,47 @@
           <w:sz w:val="20"/>
           <w:szCs w:val="20"/>
         </w:rPr>
+        <w:t>335. DIGIMON S3 DISC 7</w:t>
+      </w:r>
+    </w:p>
+    <w:p>
+      <w:pPr>
+        <w:spacing w:line="480" w:lineRule="auto"/>
+        <w:rPr>
+          <w:rFonts w:ascii="Arial" w:eastAsia="Arial" w:hAnsi="Arial" w:cs="Arial"/>
+          <w:b/>
+          <w:sz w:val="20"/>
+          <w:szCs w:val="20"/>
+        </w:rPr>
+      </w:pPr>
+      <w:r>
+        <w:rPr>
+          <w:rFonts w:ascii="Arial" w:eastAsia="Arial" w:hAnsi="Arial" w:cs="Arial"/>
+          <w:b/>
+          <w:sz w:val="20"/>
+          <w:szCs w:val="20"/>
+        </w:rPr>
+        <w:t>336. DIGIMON S3 DISC 8</w:t>
+      </w:r>
+    </w:p>
+    <w:p>
+      <w:pPr>
+        <w:spacing w:line="480" w:lineRule="auto"/>
+        <w:rPr>
+          <w:rFonts w:ascii="Arial" w:eastAsia="Arial" w:hAnsi="Arial" w:cs="Arial"/>
+          <w:b/>
+          <w:sz w:val="20"/>
+          <w:szCs w:val="20"/>
+        </w:rPr>
+      </w:pPr>
+      <w:r>
+        <w:rPr>
+          <w:rFonts w:ascii="Arial" w:eastAsia="Arial" w:hAnsi="Arial" w:cs="Arial"/>
+          <w:b/>
+          <w:sz w:val="20"/>
+          <w:szCs w:val="20"/>
+        </w:rPr>
         <w:lastRenderedPageBreak/>
-        <w:t>335. DIGIMON S3 DISC 7</w:t>
-      </w:r>
-    </w:p>
-    <w:p>
-      <w:pPr>
-        <w:spacing w:line="480" w:lineRule="auto"/>
-        <w:rPr>
-          <w:rFonts w:ascii="Arial" w:eastAsia="Arial" w:hAnsi="Arial" w:cs="Arial"/>
-          <w:b/>
-          <w:sz w:val="20"/>
-          <w:szCs w:val="20"/>
-        </w:rPr>
-      </w:pPr>
-      <w:r>
-        <w:rPr>
-          <w:rFonts w:ascii="Arial" w:eastAsia="Arial" w:hAnsi="Arial" w:cs="Arial"/>
-          <w:b/>
-          <w:sz w:val="20"/>
-          <w:szCs w:val="20"/>
-        </w:rPr>
-        <w:t>336. DIGIMON S3 DISC 8</w:t>
-      </w:r>
-    </w:p>
-    <w:p>
-      <w:pPr>
-        <w:spacing w:line="480" w:lineRule="auto"/>
-        <w:rPr>
-          <w:rFonts w:ascii="Arial" w:eastAsia="Arial" w:hAnsi="Arial" w:cs="Arial"/>
-          <w:b/>
-          <w:sz w:val="20"/>
-          <w:szCs w:val="20"/>
-        </w:rPr>
-      </w:pPr>
-      <w:r>
-        <w:rPr>
-          <w:rFonts w:ascii="Arial" w:eastAsia="Arial" w:hAnsi="Arial" w:cs="Arial"/>
-          <w:b/>
-          <w:sz w:val="20"/>
-          <w:szCs w:val="20"/>
-        </w:rPr>
         <w:t>337. DIGIMON S4 DISC 1</w:t>
       </w:r>
     </w:p>
@@ -7392,7 +7364,6 @@
           <w:sz w:val="20"/>
           <w:szCs w:val="20"/>
         </w:rPr>
-        <w:lastRenderedPageBreak/>
         <w:t>367. Spongebob Season 6 Disc 2</w:t>
       </w:r>
       <w:r>
@@ -7423,6 +7394,7 @@
           <w:sz w:val="20"/>
           <w:szCs w:val="20"/>
         </w:rPr>
+        <w:lastRenderedPageBreak/>
         <w:t>369. Spongebob Season 6 Disc 4</w:t>
       </w:r>
     </w:p>
@@ -8023,47 +7995,47 @@
           <w:sz w:val="20"/>
           <w:szCs w:val="20"/>
         </w:rPr>
+        <w:t>399. Street Sharks Disc 4</w:t>
+      </w:r>
+    </w:p>
+    <w:p>
+      <w:pPr>
+        <w:spacing w:line="480" w:lineRule="auto"/>
+        <w:rPr>
+          <w:rFonts w:ascii="Arial" w:eastAsia="Arial" w:hAnsi="Arial" w:cs="Arial"/>
+          <w:b/>
+          <w:sz w:val="20"/>
+          <w:szCs w:val="20"/>
+        </w:rPr>
+      </w:pPr>
+      <w:r>
+        <w:rPr>
+          <w:rFonts w:ascii="Arial" w:eastAsia="Arial" w:hAnsi="Arial" w:cs="Arial"/>
+          <w:b/>
+          <w:sz w:val="20"/>
+          <w:szCs w:val="20"/>
+        </w:rPr>
+        <w:t>400. X-Men Volume 1</w:t>
+      </w:r>
+    </w:p>
+    <w:p>
+      <w:pPr>
+        <w:spacing w:line="480" w:lineRule="auto"/>
+        <w:rPr>
+          <w:rFonts w:ascii="Arial" w:eastAsia="Arial" w:hAnsi="Arial" w:cs="Arial"/>
+          <w:b/>
+          <w:sz w:val="20"/>
+          <w:szCs w:val="20"/>
+        </w:rPr>
+      </w:pPr>
+      <w:r>
+        <w:rPr>
+          <w:rFonts w:ascii="Arial" w:eastAsia="Arial" w:hAnsi="Arial" w:cs="Arial"/>
+          <w:b/>
+          <w:sz w:val="20"/>
+          <w:szCs w:val="20"/>
+        </w:rPr>
         <w:lastRenderedPageBreak/>
-        <w:t>399. Street Sharks Disc 4</w:t>
-      </w:r>
-    </w:p>
-    <w:p>
-      <w:pPr>
-        <w:spacing w:line="480" w:lineRule="auto"/>
-        <w:rPr>
-          <w:rFonts w:ascii="Arial" w:eastAsia="Arial" w:hAnsi="Arial" w:cs="Arial"/>
-          <w:b/>
-          <w:sz w:val="20"/>
-          <w:szCs w:val="20"/>
-        </w:rPr>
-      </w:pPr>
-      <w:r>
-        <w:rPr>
-          <w:rFonts w:ascii="Arial" w:eastAsia="Arial" w:hAnsi="Arial" w:cs="Arial"/>
-          <w:b/>
-          <w:sz w:val="20"/>
-          <w:szCs w:val="20"/>
-        </w:rPr>
-        <w:t>400. X-Men Volume 1</w:t>
-      </w:r>
-    </w:p>
-    <w:p>
-      <w:pPr>
-        <w:spacing w:line="480" w:lineRule="auto"/>
-        <w:rPr>
-          <w:rFonts w:ascii="Arial" w:eastAsia="Arial" w:hAnsi="Arial" w:cs="Arial"/>
-          <w:b/>
-          <w:sz w:val="20"/>
-          <w:szCs w:val="20"/>
-        </w:rPr>
-      </w:pPr>
-      <w:r>
-        <w:rPr>
-          <w:rFonts w:ascii="Arial" w:eastAsia="Arial" w:hAnsi="Arial" w:cs="Arial"/>
-          <w:b/>
-          <w:sz w:val="20"/>
-          <w:szCs w:val="20"/>
-        </w:rPr>
         <w:t>401. Sonic Underground Volume 1</w:t>
       </w:r>
     </w:p>
@@ -8644,47 +8616,47 @@
           <w:sz w:val="20"/>
           <w:szCs w:val="20"/>
         </w:rPr>
+        <w:t>431.  ANGRY BEAVERS  VOLUME 1 DISC 2</w:t>
+      </w:r>
+    </w:p>
+    <w:p>
+      <w:pPr>
+        <w:spacing w:line="480" w:lineRule="auto"/>
+        <w:rPr>
+          <w:rFonts w:ascii="Arial" w:eastAsia="Arial" w:hAnsi="Arial" w:cs="Arial"/>
+          <w:b/>
+          <w:sz w:val="20"/>
+          <w:szCs w:val="20"/>
+        </w:rPr>
+      </w:pPr>
+      <w:r>
+        <w:rPr>
+          <w:rFonts w:ascii="Arial" w:eastAsia="Arial" w:hAnsi="Arial" w:cs="Arial"/>
+          <w:b/>
+          <w:sz w:val="20"/>
+          <w:szCs w:val="20"/>
+        </w:rPr>
+        <w:t>432.  ANGRY BEAVERS  VOLUME 1 DISC 3</w:t>
+      </w:r>
+    </w:p>
+    <w:p>
+      <w:pPr>
+        <w:spacing w:line="480" w:lineRule="auto"/>
+        <w:rPr>
+          <w:rFonts w:ascii="Arial" w:eastAsia="Arial" w:hAnsi="Arial" w:cs="Arial"/>
+          <w:b/>
+          <w:sz w:val="20"/>
+          <w:szCs w:val="20"/>
+        </w:rPr>
+      </w:pPr>
+      <w:r>
+        <w:rPr>
+          <w:rFonts w:ascii="Arial" w:eastAsia="Arial" w:hAnsi="Arial" w:cs="Arial"/>
+          <w:b/>
+          <w:sz w:val="20"/>
+          <w:szCs w:val="20"/>
+        </w:rPr>
         <w:lastRenderedPageBreak/>
-        <w:t>431.  ANGRY BEAVERS  VOLUME 1 DISC 2</w:t>
-      </w:r>
-    </w:p>
-    <w:p>
-      <w:pPr>
-        <w:spacing w:line="480" w:lineRule="auto"/>
-        <w:rPr>
-          <w:rFonts w:ascii="Arial" w:eastAsia="Arial" w:hAnsi="Arial" w:cs="Arial"/>
-          <w:b/>
-          <w:sz w:val="20"/>
-          <w:szCs w:val="20"/>
-        </w:rPr>
-      </w:pPr>
-      <w:r>
-        <w:rPr>
-          <w:rFonts w:ascii="Arial" w:eastAsia="Arial" w:hAnsi="Arial" w:cs="Arial"/>
-          <w:b/>
-          <w:sz w:val="20"/>
-          <w:szCs w:val="20"/>
-        </w:rPr>
-        <w:t>432.  ANGRY BEAVERS  VOLUME 1 DISC 3</w:t>
-      </w:r>
-    </w:p>
-    <w:p>
-      <w:pPr>
-        <w:spacing w:line="480" w:lineRule="auto"/>
-        <w:rPr>
-          <w:rFonts w:ascii="Arial" w:eastAsia="Arial" w:hAnsi="Arial" w:cs="Arial"/>
-          <w:b/>
-          <w:sz w:val="20"/>
-          <w:szCs w:val="20"/>
-        </w:rPr>
-      </w:pPr>
-      <w:r>
-        <w:rPr>
-          <w:rFonts w:ascii="Arial" w:eastAsia="Arial" w:hAnsi="Arial" w:cs="Arial"/>
-          <w:b/>
-          <w:sz w:val="20"/>
-          <w:szCs w:val="20"/>
-        </w:rPr>
         <w:t>433.  ANGRY BEAVERS  VOLUME 1 DISC 4</w:t>
       </w:r>
     </w:p>
@@ -9441,47 +9413,47 @@
           <w:sz w:val="20"/>
           <w:szCs w:val="20"/>
         </w:rPr>
+        <w:t>463. THE WILD THORNBERRYS SEASON 1 DISC 1</w:t>
+      </w:r>
+    </w:p>
+    <w:p>
+      <w:pPr>
+        <w:spacing w:line="480" w:lineRule="auto"/>
+        <w:rPr>
+          <w:rFonts w:ascii="Arial" w:eastAsia="Arial" w:hAnsi="Arial" w:cs="Arial"/>
+          <w:b/>
+          <w:sz w:val="20"/>
+          <w:szCs w:val="20"/>
+        </w:rPr>
+      </w:pPr>
+      <w:r>
+        <w:rPr>
+          <w:rFonts w:ascii="Arial" w:eastAsia="Arial" w:hAnsi="Arial" w:cs="Arial"/>
+          <w:b/>
+          <w:sz w:val="20"/>
+          <w:szCs w:val="20"/>
+        </w:rPr>
+        <w:t>464. THE WILD THORNBERRYS SEASON 1 DISC 2</w:t>
+      </w:r>
+    </w:p>
+    <w:p>
+      <w:pPr>
+        <w:spacing w:line="480" w:lineRule="auto"/>
+        <w:rPr>
+          <w:rFonts w:ascii="Arial" w:eastAsia="Arial" w:hAnsi="Arial" w:cs="Arial"/>
+          <w:b/>
+          <w:sz w:val="20"/>
+          <w:szCs w:val="20"/>
+        </w:rPr>
+      </w:pPr>
+      <w:r>
+        <w:rPr>
+          <w:rFonts w:ascii="Arial" w:eastAsia="Arial" w:hAnsi="Arial" w:cs="Arial"/>
+          <w:b/>
+          <w:sz w:val="20"/>
+          <w:szCs w:val="20"/>
+        </w:rPr>
         <w:lastRenderedPageBreak/>
-        <w:t>463. THE WILD THORNBERRYS SEASON 1 DISC 1</w:t>
-      </w:r>
-    </w:p>
-    <w:p>
-      <w:pPr>
-        <w:spacing w:line="480" w:lineRule="auto"/>
-        <w:rPr>
-          <w:rFonts w:ascii="Arial" w:eastAsia="Arial" w:hAnsi="Arial" w:cs="Arial"/>
-          <w:b/>
-          <w:sz w:val="20"/>
-          <w:szCs w:val="20"/>
-        </w:rPr>
-      </w:pPr>
-      <w:r>
-        <w:rPr>
-          <w:rFonts w:ascii="Arial" w:eastAsia="Arial" w:hAnsi="Arial" w:cs="Arial"/>
-          <w:b/>
-          <w:sz w:val="20"/>
-          <w:szCs w:val="20"/>
-        </w:rPr>
-        <w:t>464. THE WILD THORNBERRYS SEASON 1 DISC 2</w:t>
-      </w:r>
-    </w:p>
-    <w:p>
-      <w:pPr>
-        <w:spacing w:line="480" w:lineRule="auto"/>
-        <w:rPr>
-          <w:rFonts w:ascii="Arial" w:eastAsia="Arial" w:hAnsi="Arial" w:cs="Arial"/>
-          <w:b/>
-          <w:sz w:val="20"/>
-          <w:szCs w:val="20"/>
-        </w:rPr>
-      </w:pPr>
-      <w:r>
-        <w:rPr>
-          <w:rFonts w:ascii="Arial" w:eastAsia="Arial" w:hAnsi="Arial" w:cs="Arial"/>
-          <w:b/>
-          <w:sz w:val="20"/>
-          <w:szCs w:val="20"/>
-        </w:rPr>
         <w:t>465.</w:t>
       </w:r>
       <w:r>
@@ -10170,47 +10142,47 @@
           <w:sz w:val="20"/>
           <w:szCs w:val="20"/>
         </w:rPr>
+        <w:t>495.  JOHNNY QUEST    The Complete First Season    DISC 3</w:t>
+      </w:r>
+    </w:p>
+    <w:p>
+      <w:pPr>
+        <w:spacing w:line="480" w:lineRule="auto"/>
+        <w:rPr>
+          <w:rFonts w:ascii="Arial" w:eastAsia="Arial" w:hAnsi="Arial" w:cs="Arial"/>
+          <w:b/>
+          <w:sz w:val="20"/>
+          <w:szCs w:val="20"/>
+        </w:rPr>
+      </w:pPr>
+      <w:r>
+        <w:rPr>
+          <w:rFonts w:ascii="Arial" w:eastAsia="Arial" w:hAnsi="Arial" w:cs="Arial"/>
+          <w:b/>
+          <w:sz w:val="20"/>
+          <w:szCs w:val="20"/>
+        </w:rPr>
+        <w:t>496.  50 CARTOON COLLECTION LOONEY TUNES   Disc 1</w:t>
+      </w:r>
+    </w:p>
+    <w:p>
+      <w:pPr>
+        <w:spacing w:line="480" w:lineRule="auto"/>
+        <w:rPr>
+          <w:rFonts w:ascii="Arial" w:eastAsia="Arial" w:hAnsi="Arial" w:cs="Arial"/>
+          <w:b/>
+          <w:sz w:val="20"/>
+          <w:szCs w:val="20"/>
+        </w:rPr>
+      </w:pPr>
+      <w:r>
+        <w:rPr>
+          <w:rFonts w:ascii="Arial" w:eastAsia="Arial" w:hAnsi="Arial" w:cs="Arial"/>
+          <w:b/>
+          <w:sz w:val="20"/>
+          <w:szCs w:val="20"/>
+        </w:rPr>
         <w:lastRenderedPageBreak/>
-        <w:t>495.  JOHNNY QUEST    The Complete First Season    DISC 3</w:t>
-      </w:r>
-    </w:p>
-    <w:p>
-      <w:pPr>
-        <w:spacing w:line="480" w:lineRule="auto"/>
-        <w:rPr>
-          <w:rFonts w:ascii="Arial" w:eastAsia="Arial" w:hAnsi="Arial" w:cs="Arial"/>
-          <w:b/>
-          <w:sz w:val="20"/>
-          <w:szCs w:val="20"/>
-        </w:rPr>
-      </w:pPr>
-      <w:r>
-        <w:rPr>
-          <w:rFonts w:ascii="Arial" w:eastAsia="Arial" w:hAnsi="Arial" w:cs="Arial"/>
-          <w:b/>
-          <w:sz w:val="20"/>
-          <w:szCs w:val="20"/>
-        </w:rPr>
-        <w:t>496.  50 CARTOON COLLECTION LOONEY TUNES   Disc 1</w:t>
-      </w:r>
-    </w:p>
-    <w:p>
-      <w:pPr>
-        <w:spacing w:line="480" w:lineRule="auto"/>
-        <w:rPr>
-          <w:rFonts w:ascii="Arial" w:eastAsia="Arial" w:hAnsi="Arial" w:cs="Arial"/>
-          <w:b/>
-          <w:sz w:val="20"/>
-          <w:szCs w:val="20"/>
-        </w:rPr>
-      </w:pPr>
-      <w:r>
-        <w:rPr>
-          <w:rFonts w:ascii="Arial" w:eastAsia="Arial" w:hAnsi="Arial" w:cs="Arial"/>
-          <w:b/>
-          <w:sz w:val="20"/>
-          <w:szCs w:val="20"/>
-        </w:rPr>
         <w:t>497.  50 CARTOON COLLECTION LOONEY TUNES    Disc 2</w:t>
       </w:r>
     </w:p>
@@ -11141,47 +11113,47 @@
           <w:sz w:val="20"/>
           <w:szCs w:val="20"/>
         </w:rPr>
+        <w:t>527. Transformers Generation One Disc 2</w:t>
+      </w:r>
+    </w:p>
+    <w:p>
+      <w:pPr>
+        <w:spacing w:line="480" w:lineRule="auto"/>
+        <w:rPr>
+          <w:rFonts w:ascii="Arial" w:eastAsia="Arial" w:hAnsi="Arial" w:cs="Arial"/>
+          <w:b/>
+          <w:sz w:val="20"/>
+          <w:szCs w:val="20"/>
+        </w:rPr>
+      </w:pPr>
+      <w:r>
+        <w:rPr>
+          <w:rFonts w:ascii="Arial" w:eastAsia="Arial" w:hAnsi="Arial" w:cs="Arial"/>
+          <w:b/>
+          <w:sz w:val="20"/>
+          <w:szCs w:val="20"/>
+        </w:rPr>
+        <w:t>528. Transformers Generation One Disc 3</w:t>
+      </w:r>
+    </w:p>
+    <w:p>
+      <w:pPr>
+        <w:spacing w:line="480" w:lineRule="auto"/>
+        <w:rPr>
+          <w:rFonts w:ascii="Arial" w:eastAsia="Arial" w:hAnsi="Arial" w:cs="Arial"/>
+          <w:b/>
+          <w:sz w:val="20"/>
+          <w:szCs w:val="20"/>
+        </w:rPr>
+      </w:pPr>
+      <w:r>
+        <w:rPr>
+          <w:rFonts w:ascii="Arial" w:eastAsia="Arial" w:hAnsi="Arial" w:cs="Arial"/>
+          <w:b/>
+          <w:sz w:val="20"/>
+          <w:szCs w:val="20"/>
+        </w:rPr>
         <w:lastRenderedPageBreak/>
-        <w:t>527. Transformers Generation One Disc 2</w:t>
-      </w:r>
-    </w:p>
-    <w:p>
-      <w:pPr>
-        <w:spacing w:line="480" w:lineRule="auto"/>
-        <w:rPr>
-          <w:rFonts w:ascii="Arial" w:eastAsia="Arial" w:hAnsi="Arial" w:cs="Arial"/>
-          <w:b/>
-          <w:sz w:val="20"/>
-          <w:szCs w:val="20"/>
-        </w:rPr>
-      </w:pPr>
-      <w:r>
-        <w:rPr>
-          <w:rFonts w:ascii="Arial" w:eastAsia="Arial" w:hAnsi="Arial" w:cs="Arial"/>
-          <w:b/>
-          <w:sz w:val="20"/>
-          <w:szCs w:val="20"/>
-        </w:rPr>
-        <w:t>528. Transformers Generation One Disc 3</w:t>
-      </w:r>
-    </w:p>
-    <w:p>
-      <w:pPr>
-        <w:spacing w:line="480" w:lineRule="auto"/>
-        <w:rPr>
-          <w:rFonts w:ascii="Arial" w:eastAsia="Arial" w:hAnsi="Arial" w:cs="Arial"/>
-          <w:b/>
-          <w:sz w:val="20"/>
-          <w:szCs w:val="20"/>
-        </w:rPr>
-      </w:pPr>
-      <w:r>
-        <w:rPr>
-          <w:rFonts w:ascii="Arial" w:eastAsia="Arial" w:hAnsi="Arial" w:cs="Arial"/>
-          <w:b/>
-          <w:sz w:val="20"/>
-          <w:szCs w:val="20"/>
-        </w:rPr>
         <w:t>529. Generator Rex Disc 1</w:t>
       </w:r>
     </w:p>
@@ -11782,47 +11754,47 @@
           <w:sz w:val="20"/>
           <w:szCs w:val="20"/>
         </w:rPr>
+        <w:t>559. BEETLEJUICE SEASON 4 PART ONE DISC1</w:t>
+      </w:r>
+    </w:p>
+    <w:p>
+      <w:pPr>
+        <w:spacing w:line="480" w:lineRule="auto"/>
+        <w:rPr>
+          <w:rFonts w:ascii="Arial" w:eastAsia="Arial" w:hAnsi="Arial" w:cs="Arial"/>
+          <w:b/>
+          <w:sz w:val="20"/>
+          <w:szCs w:val="20"/>
+        </w:rPr>
+      </w:pPr>
+      <w:r>
+        <w:rPr>
+          <w:rFonts w:ascii="Arial" w:eastAsia="Arial" w:hAnsi="Arial" w:cs="Arial"/>
+          <w:b/>
+          <w:sz w:val="20"/>
+          <w:szCs w:val="20"/>
+        </w:rPr>
+        <w:t>560. BEETLEJUICE SEASON 4 PART ONE DISC 2</w:t>
+      </w:r>
+    </w:p>
+    <w:p>
+      <w:pPr>
+        <w:spacing w:line="480" w:lineRule="auto"/>
+        <w:rPr>
+          <w:rFonts w:ascii="Arial" w:eastAsia="Arial" w:hAnsi="Arial" w:cs="Arial"/>
+          <w:b/>
+          <w:sz w:val="20"/>
+          <w:szCs w:val="20"/>
+        </w:rPr>
+      </w:pPr>
+      <w:r>
+        <w:rPr>
+          <w:rFonts w:ascii="Arial" w:eastAsia="Arial" w:hAnsi="Arial" w:cs="Arial"/>
+          <w:b/>
+          <w:sz w:val="20"/>
+          <w:szCs w:val="20"/>
+        </w:rPr>
         <w:lastRenderedPageBreak/>
-        <w:t>559. BEETLEJUICE SEASON 4 PART ONE DISC1</w:t>
-      </w:r>
-    </w:p>
-    <w:p>
-      <w:pPr>
-        <w:spacing w:line="480" w:lineRule="auto"/>
-        <w:rPr>
-          <w:rFonts w:ascii="Arial" w:eastAsia="Arial" w:hAnsi="Arial" w:cs="Arial"/>
-          <w:b/>
-          <w:sz w:val="20"/>
-          <w:szCs w:val="20"/>
-        </w:rPr>
-      </w:pPr>
-      <w:r>
-        <w:rPr>
-          <w:rFonts w:ascii="Arial" w:eastAsia="Arial" w:hAnsi="Arial" w:cs="Arial"/>
-          <w:b/>
-          <w:sz w:val="20"/>
-          <w:szCs w:val="20"/>
-        </w:rPr>
-        <w:t>560. BEETLEJUICE SEASON 4 PART ONE DISC 2</w:t>
-      </w:r>
-    </w:p>
-    <w:p>
-      <w:pPr>
-        <w:spacing w:line="480" w:lineRule="auto"/>
-        <w:rPr>
-          <w:rFonts w:ascii="Arial" w:eastAsia="Arial" w:hAnsi="Arial" w:cs="Arial"/>
-          <w:b/>
-          <w:sz w:val="20"/>
-          <w:szCs w:val="20"/>
-        </w:rPr>
-      </w:pPr>
-      <w:r>
-        <w:rPr>
-          <w:rFonts w:ascii="Arial" w:eastAsia="Arial" w:hAnsi="Arial" w:cs="Arial"/>
-          <w:b/>
-          <w:sz w:val="20"/>
-          <w:szCs w:val="20"/>
-        </w:rPr>
         <w:t>561. BEETLEJUICE SEASON 4 PART ONE DISC 3</w:t>
       </w:r>
     </w:p>
@@ -12423,47 +12395,47 @@
           <w:sz w:val="20"/>
           <w:szCs w:val="20"/>
         </w:rPr>
+        <w:t>590. DROOPY THE COMPLETE THEATRICAL COLLECTION DISC 1</w:t>
+      </w:r>
+    </w:p>
+    <w:p>
+      <w:pPr>
+        <w:spacing w:line="480" w:lineRule="auto"/>
+        <w:rPr>
+          <w:rFonts w:ascii="Arial" w:eastAsia="Arial" w:hAnsi="Arial" w:cs="Arial"/>
+          <w:b/>
+          <w:sz w:val="20"/>
+          <w:szCs w:val="20"/>
+        </w:rPr>
+      </w:pPr>
+      <w:r>
+        <w:rPr>
+          <w:rFonts w:ascii="Arial" w:eastAsia="Arial" w:hAnsi="Arial" w:cs="Arial"/>
+          <w:b/>
+          <w:sz w:val="20"/>
+          <w:szCs w:val="20"/>
+        </w:rPr>
+        <w:t>591. DROOPY THE COMPLETE THEATRICAL COLLECTION DISC 2</w:t>
+      </w:r>
+    </w:p>
+    <w:p>
+      <w:pPr>
+        <w:spacing w:line="480" w:lineRule="auto"/>
+        <w:rPr>
+          <w:rFonts w:ascii="Arial" w:eastAsia="Arial" w:hAnsi="Arial" w:cs="Arial"/>
+          <w:b/>
+          <w:sz w:val="20"/>
+          <w:szCs w:val="20"/>
+        </w:rPr>
+      </w:pPr>
+      <w:r>
+        <w:rPr>
+          <w:rFonts w:ascii="Arial" w:eastAsia="Arial" w:hAnsi="Arial" w:cs="Arial"/>
+          <w:b/>
+          <w:sz w:val="20"/>
+          <w:szCs w:val="20"/>
+        </w:rPr>
         <w:lastRenderedPageBreak/>
-        <w:t>590. DROOPY THE COMPLETE THEATRICAL COLLECTION DISC 1</w:t>
-      </w:r>
-    </w:p>
-    <w:p>
-      <w:pPr>
-        <w:spacing w:line="480" w:lineRule="auto"/>
-        <w:rPr>
-          <w:rFonts w:ascii="Arial" w:eastAsia="Arial" w:hAnsi="Arial" w:cs="Arial"/>
-          <w:b/>
-          <w:sz w:val="20"/>
-          <w:szCs w:val="20"/>
-        </w:rPr>
-      </w:pPr>
-      <w:r>
-        <w:rPr>
-          <w:rFonts w:ascii="Arial" w:eastAsia="Arial" w:hAnsi="Arial" w:cs="Arial"/>
-          <w:b/>
-          <w:sz w:val="20"/>
-          <w:szCs w:val="20"/>
-        </w:rPr>
-        <w:t>591. DROOPY THE COMPLETE THEATRICAL COLLECTION DISC 2</w:t>
-      </w:r>
-    </w:p>
-    <w:p>
-      <w:pPr>
-        <w:spacing w:line="480" w:lineRule="auto"/>
-        <w:rPr>
-          <w:rFonts w:ascii="Arial" w:eastAsia="Arial" w:hAnsi="Arial" w:cs="Arial"/>
-          <w:b/>
-          <w:sz w:val="20"/>
-          <w:szCs w:val="20"/>
-        </w:rPr>
-      </w:pPr>
-      <w:r>
-        <w:rPr>
-          <w:rFonts w:ascii="Arial" w:eastAsia="Arial" w:hAnsi="Arial" w:cs="Arial"/>
-          <w:b/>
-          <w:sz w:val="20"/>
-          <w:szCs w:val="20"/>
-        </w:rPr>
         <w:t>592. HANNA BARBERA HOLIDAY TRIPLE FEATURE</w:t>
       </w:r>
     </w:p>
@@ -13064,47 +13036,47 @@
           <w:sz w:val="20"/>
           <w:szCs w:val="20"/>
         </w:rPr>
+        <w:t>622. FERDINAND</w:t>
+      </w:r>
+    </w:p>
+    <w:p>
+      <w:pPr>
+        <w:spacing w:line="480" w:lineRule="auto"/>
+        <w:rPr>
+          <w:rFonts w:ascii="Arial" w:eastAsia="Arial" w:hAnsi="Arial" w:cs="Arial"/>
+          <w:b/>
+          <w:sz w:val="20"/>
+          <w:szCs w:val="20"/>
+        </w:rPr>
+      </w:pPr>
+      <w:r>
+        <w:rPr>
+          <w:rFonts w:ascii="Arial" w:eastAsia="Arial" w:hAnsi="Arial" w:cs="Arial"/>
+          <w:b/>
+          <w:sz w:val="20"/>
+          <w:szCs w:val="20"/>
+        </w:rPr>
+        <w:t>623. THE JUNGLE BOOK</w:t>
+      </w:r>
+    </w:p>
+    <w:p>
+      <w:pPr>
+        <w:spacing w:line="480" w:lineRule="auto"/>
+        <w:rPr>
+          <w:rFonts w:ascii="Arial" w:eastAsia="Arial" w:hAnsi="Arial" w:cs="Arial"/>
+          <w:b/>
+          <w:sz w:val="20"/>
+          <w:szCs w:val="20"/>
+        </w:rPr>
+      </w:pPr>
+      <w:r>
+        <w:rPr>
+          <w:rFonts w:ascii="Arial" w:eastAsia="Arial" w:hAnsi="Arial" w:cs="Arial"/>
+          <w:b/>
+          <w:sz w:val="20"/>
+          <w:szCs w:val="20"/>
+        </w:rPr>
         <w:lastRenderedPageBreak/>
-        <w:t>622. FERDINAND</w:t>
-      </w:r>
-    </w:p>
-    <w:p>
-      <w:pPr>
-        <w:spacing w:line="480" w:lineRule="auto"/>
-        <w:rPr>
-          <w:rFonts w:ascii="Arial" w:eastAsia="Arial" w:hAnsi="Arial" w:cs="Arial"/>
-          <w:b/>
-          <w:sz w:val="20"/>
-          <w:szCs w:val="20"/>
-        </w:rPr>
-      </w:pPr>
-      <w:r>
-        <w:rPr>
-          <w:rFonts w:ascii="Arial" w:eastAsia="Arial" w:hAnsi="Arial" w:cs="Arial"/>
-          <w:b/>
-          <w:sz w:val="20"/>
-          <w:szCs w:val="20"/>
-        </w:rPr>
-        <w:t>623. THE JUNGLE BOOK</w:t>
-      </w:r>
-    </w:p>
-    <w:p>
-      <w:pPr>
-        <w:spacing w:line="480" w:lineRule="auto"/>
-        <w:rPr>
-          <w:rFonts w:ascii="Arial" w:eastAsia="Arial" w:hAnsi="Arial" w:cs="Arial"/>
-          <w:b/>
-          <w:sz w:val="20"/>
-          <w:szCs w:val="20"/>
-        </w:rPr>
-      </w:pPr>
-      <w:r>
-        <w:rPr>
-          <w:rFonts w:ascii="Arial" w:eastAsia="Arial" w:hAnsi="Arial" w:cs="Arial"/>
-          <w:b/>
-          <w:sz w:val="20"/>
-          <w:szCs w:val="20"/>
-        </w:rPr>
         <w:t>624. THE JUNGLE BOOK 2</w:t>
       </w:r>
     </w:p>
@@ -13705,7 +13677,6 @@
           <w:sz w:val="20"/>
           <w:szCs w:val="20"/>
         </w:rPr>
-        <w:lastRenderedPageBreak/>
         <w:t>654. DINOSAUCERS</w:t>
       </w:r>
       <w:r>
@@ -13736,6 +13707,7 @@
           <w:sz w:val="20"/>
           <w:szCs w:val="20"/>
         </w:rPr>
+        <w:lastRenderedPageBreak/>
         <w:t>656. CAPTAIN STAR</w:t>
       </w:r>
     </w:p>
@@ -14336,47 +14308,47 @@
           <w:sz w:val="20"/>
           <w:szCs w:val="20"/>
         </w:rPr>
+        <w:t>686. IT’S PUNKY BREWSTER</w:t>
+      </w:r>
+    </w:p>
+    <w:p>
+      <w:pPr>
+        <w:spacing w:line="480" w:lineRule="auto"/>
+        <w:rPr>
+          <w:rFonts w:ascii="Arial" w:eastAsia="Arial" w:hAnsi="Arial" w:cs="Arial"/>
+          <w:b/>
+          <w:sz w:val="20"/>
+          <w:szCs w:val="20"/>
+        </w:rPr>
+      </w:pPr>
+      <w:r>
+        <w:rPr>
+          <w:rFonts w:ascii="Arial" w:eastAsia="Arial" w:hAnsi="Arial" w:cs="Arial"/>
+          <w:b/>
+          <w:sz w:val="20"/>
+          <w:szCs w:val="20"/>
+        </w:rPr>
+        <w:t>687. JAYCE AND THE WHEELED WARRIORS</w:t>
+      </w:r>
+    </w:p>
+    <w:p>
+      <w:pPr>
+        <w:spacing w:line="480" w:lineRule="auto"/>
+        <w:rPr>
+          <w:rFonts w:ascii="Arial" w:eastAsia="Arial" w:hAnsi="Arial" w:cs="Arial"/>
+          <w:b/>
+          <w:sz w:val="20"/>
+          <w:szCs w:val="20"/>
+        </w:rPr>
+      </w:pPr>
+      <w:r>
+        <w:rPr>
+          <w:rFonts w:ascii="Arial" w:eastAsia="Arial" w:hAnsi="Arial" w:cs="Arial"/>
+          <w:b/>
+          <w:sz w:val="20"/>
+          <w:szCs w:val="20"/>
+        </w:rPr>
         <w:lastRenderedPageBreak/>
-        <w:t>686. IT’S PUNKY BREWSTER</w:t>
-      </w:r>
-    </w:p>
-    <w:p>
-      <w:pPr>
-        <w:spacing w:line="480" w:lineRule="auto"/>
-        <w:rPr>
-          <w:rFonts w:ascii="Arial" w:eastAsia="Arial" w:hAnsi="Arial" w:cs="Arial"/>
-          <w:b/>
-          <w:sz w:val="20"/>
-          <w:szCs w:val="20"/>
-        </w:rPr>
-      </w:pPr>
-      <w:r>
-        <w:rPr>
-          <w:rFonts w:ascii="Arial" w:eastAsia="Arial" w:hAnsi="Arial" w:cs="Arial"/>
-          <w:b/>
-          <w:sz w:val="20"/>
-          <w:szCs w:val="20"/>
-        </w:rPr>
-        <w:t>687. JAYCE AND THE WHEELED WARRIORS</w:t>
-      </w:r>
-    </w:p>
-    <w:p>
-      <w:pPr>
-        <w:spacing w:line="480" w:lineRule="auto"/>
-        <w:rPr>
-          <w:rFonts w:ascii="Arial" w:eastAsia="Arial" w:hAnsi="Arial" w:cs="Arial"/>
-          <w:b/>
-          <w:sz w:val="20"/>
-          <w:szCs w:val="20"/>
-        </w:rPr>
-      </w:pPr>
-      <w:r>
-        <w:rPr>
-          <w:rFonts w:ascii="Arial" w:eastAsia="Arial" w:hAnsi="Arial" w:cs="Arial"/>
-          <w:b/>
-          <w:sz w:val="20"/>
-          <w:szCs w:val="20"/>
-        </w:rPr>
         <w:t>688. THE KARATE KID</w:t>
       </w:r>
     </w:p>
@@ -14977,47 +14949,47 @@
           <w:sz w:val="20"/>
           <w:szCs w:val="20"/>
         </w:rPr>
+        <w:t>718. OCEAN GIRL</w:t>
+      </w:r>
+    </w:p>
+    <w:p>
+      <w:pPr>
+        <w:spacing w:line="480" w:lineRule="auto"/>
+        <w:rPr>
+          <w:rFonts w:ascii="Arial" w:eastAsia="Arial" w:hAnsi="Arial" w:cs="Arial"/>
+          <w:b/>
+          <w:sz w:val="20"/>
+          <w:szCs w:val="20"/>
+        </w:rPr>
+      </w:pPr>
+      <w:r>
+        <w:rPr>
+          <w:rFonts w:ascii="Arial" w:eastAsia="Arial" w:hAnsi="Arial" w:cs="Arial"/>
+          <w:b/>
+          <w:sz w:val="20"/>
+          <w:szCs w:val="20"/>
+        </w:rPr>
+        <w:t>719. OGGY AND THE COCKROACHES</w:t>
+      </w:r>
+    </w:p>
+    <w:p>
+      <w:pPr>
+        <w:spacing w:line="480" w:lineRule="auto"/>
+        <w:rPr>
+          <w:rFonts w:ascii="Arial" w:eastAsia="Arial" w:hAnsi="Arial" w:cs="Arial"/>
+          <w:b/>
+          <w:sz w:val="20"/>
+          <w:szCs w:val="20"/>
+        </w:rPr>
+      </w:pPr>
+      <w:r>
+        <w:rPr>
+          <w:rFonts w:ascii="Arial" w:eastAsia="Arial" w:hAnsi="Arial" w:cs="Arial"/>
+          <w:b/>
+          <w:sz w:val="20"/>
+          <w:szCs w:val="20"/>
+        </w:rPr>
         <w:lastRenderedPageBreak/>
-        <w:t>718. OCEAN GIRL</w:t>
-      </w:r>
-    </w:p>
-    <w:p>
-      <w:pPr>
-        <w:spacing w:line="480" w:lineRule="auto"/>
-        <w:rPr>
-          <w:rFonts w:ascii="Arial" w:eastAsia="Arial" w:hAnsi="Arial" w:cs="Arial"/>
-          <w:b/>
-          <w:sz w:val="20"/>
-          <w:szCs w:val="20"/>
-        </w:rPr>
-      </w:pPr>
-      <w:r>
-        <w:rPr>
-          <w:rFonts w:ascii="Arial" w:eastAsia="Arial" w:hAnsi="Arial" w:cs="Arial"/>
-          <w:b/>
-          <w:sz w:val="20"/>
-          <w:szCs w:val="20"/>
-        </w:rPr>
-        <w:t>719. OGGY AND THE COCKROACHES</w:t>
-      </w:r>
-    </w:p>
-    <w:p>
-      <w:pPr>
-        <w:spacing w:line="480" w:lineRule="auto"/>
-        <w:rPr>
-          <w:rFonts w:ascii="Arial" w:eastAsia="Arial" w:hAnsi="Arial" w:cs="Arial"/>
-          <w:b/>
-          <w:sz w:val="20"/>
-          <w:szCs w:val="20"/>
-        </w:rPr>
-      </w:pPr>
-      <w:r>
-        <w:rPr>
-          <w:rFonts w:ascii="Arial" w:eastAsia="Arial" w:hAnsi="Arial" w:cs="Arial"/>
-          <w:b/>
-          <w:sz w:val="20"/>
-          <w:szCs w:val="20"/>
-        </w:rPr>
         <w:t>720. ONCE UPON A TIME</w:t>
       </w:r>
     </w:p>
@@ -15690,47 +15662,47 @@
           <w:sz w:val="20"/>
           <w:szCs w:val="20"/>
         </w:rPr>
+        <w:t>750. POLICE ACADEMY</w:t>
+      </w:r>
+    </w:p>
+    <w:p>
+      <w:pPr>
+        <w:spacing w:line="480" w:lineRule="auto"/>
+        <w:rPr>
+          <w:rFonts w:ascii="Arial" w:eastAsia="Arial" w:hAnsi="Arial" w:cs="Arial"/>
+          <w:b/>
+          <w:sz w:val="20"/>
+          <w:szCs w:val="20"/>
+        </w:rPr>
+      </w:pPr>
+      <w:r>
+        <w:rPr>
+          <w:rFonts w:ascii="Arial" w:eastAsia="Arial" w:hAnsi="Arial" w:cs="Arial"/>
+          <w:b/>
+          <w:sz w:val="20"/>
+          <w:szCs w:val="20"/>
+        </w:rPr>
+        <w:t>751. POPEYE AND SON</w:t>
+      </w:r>
+    </w:p>
+    <w:p>
+      <w:pPr>
+        <w:spacing w:line="480" w:lineRule="auto"/>
+        <w:rPr>
+          <w:rFonts w:ascii="Arial" w:eastAsia="Arial" w:hAnsi="Arial" w:cs="Arial"/>
+          <w:b/>
+          <w:sz w:val="20"/>
+          <w:szCs w:val="20"/>
+        </w:rPr>
+      </w:pPr>
+      <w:r>
+        <w:rPr>
+          <w:rFonts w:ascii="Arial" w:eastAsia="Arial" w:hAnsi="Arial" w:cs="Arial"/>
+          <w:b/>
+          <w:sz w:val="20"/>
+          <w:szCs w:val="20"/>
+        </w:rPr>
         <w:lastRenderedPageBreak/>
-        <w:t>750. POLICE ACADEMY</w:t>
-      </w:r>
-    </w:p>
-    <w:p>
-      <w:pPr>
-        <w:spacing w:line="480" w:lineRule="auto"/>
-        <w:rPr>
-          <w:rFonts w:ascii="Arial" w:eastAsia="Arial" w:hAnsi="Arial" w:cs="Arial"/>
-          <w:b/>
-          <w:sz w:val="20"/>
-          <w:szCs w:val="20"/>
-        </w:rPr>
-      </w:pPr>
-      <w:r>
-        <w:rPr>
-          <w:rFonts w:ascii="Arial" w:eastAsia="Arial" w:hAnsi="Arial" w:cs="Arial"/>
-          <w:b/>
-          <w:sz w:val="20"/>
-          <w:szCs w:val="20"/>
-        </w:rPr>
-        <w:t>751. POPEYE AND SON</w:t>
-      </w:r>
-    </w:p>
-    <w:p>
-      <w:pPr>
-        <w:spacing w:line="480" w:lineRule="auto"/>
-        <w:rPr>
-          <w:rFonts w:ascii="Arial" w:eastAsia="Arial" w:hAnsi="Arial" w:cs="Arial"/>
-          <w:b/>
-          <w:sz w:val="20"/>
-          <w:szCs w:val="20"/>
-        </w:rPr>
-      </w:pPr>
-      <w:r>
-        <w:rPr>
-          <w:rFonts w:ascii="Arial" w:eastAsia="Arial" w:hAnsi="Arial" w:cs="Arial"/>
-          <w:b/>
-          <w:sz w:val="20"/>
-          <w:szCs w:val="20"/>
-        </w:rPr>
         <w:t>752. POPPLES</w:t>
       </w:r>
     </w:p>
@@ -16331,47 +16303,47 @@
           <w:sz w:val="20"/>
           <w:szCs w:val="20"/>
         </w:rPr>
+        <w:t>782. SESAME STREET</w:t>
+      </w:r>
+    </w:p>
+    <w:p>
+      <w:pPr>
+        <w:spacing w:line="480" w:lineRule="auto"/>
+        <w:rPr>
+          <w:rFonts w:ascii="Arial" w:eastAsia="Arial" w:hAnsi="Arial" w:cs="Arial"/>
+          <w:b/>
+          <w:sz w:val="20"/>
+          <w:szCs w:val="20"/>
+        </w:rPr>
+      </w:pPr>
+      <w:r>
+        <w:rPr>
+          <w:rFonts w:ascii="Arial" w:eastAsia="Arial" w:hAnsi="Arial" w:cs="Arial"/>
+          <w:b/>
+          <w:sz w:val="20"/>
+          <w:szCs w:val="20"/>
+        </w:rPr>
+        <w:t>783. SHADOW RAIDERS</w:t>
+      </w:r>
+    </w:p>
+    <w:p>
+      <w:pPr>
+        <w:spacing w:line="480" w:lineRule="auto"/>
+        <w:rPr>
+          <w:rFonts w:ascii="Arial" w:eastAsia="Arial" w:hAnsi="Arial" w:cs="Arial"/>
+          <w:b/>
+          <w:sz w:val="20"/>
+          <w:szCs w:val="20"/>
+        </w:rPr>
+      </w:pPr>
+      <w:r>
+        <w:rPr>
+          <w:rFonts w:ascii="Arial" w:eastAsia="Arial" w:hAnsi="Arial" w:cs="Arial"/>
+          <w:b/>
+          <w:sz w:val="20"/>
+          <w:szCs w:val="20"/>
+        </w:rPr>
         <w:lastRenderedPageBreak/>
-        <w:t>782. SESAME STREET</w:t>
-      </w:r>
-    </w:p>
-    <w:p>
-      <w:pPr>
-        <w:spacing w:line="480" w:lineRule="auto"/>
-        <w:rPr>
-          <w:rFonts w:ascii="Arial" w:eastAsia="Arial" w:hAnsi="Arial" w:cs="Arial"/>
-          <w:b/>
-          <w:sz w:val="20"/>
-          <w:szCs w:val="20"/>
-        </w:rPr>
-      </w:pPr>
-      <w:r>
-        <w:rPr>
-          <w:rFonts w:ascii="Arial" w:eastAsia="Arial" w:hAnsi="Arial" w:cs="Arial"/>
-          <w:b/>
-          <w:sz w:val="20"/>
-          <w:szCs w:val="20"/>
-        </w:rPr>
-        <w:t>783. SHADOW RAIDERS</w:t>
-      </w:r>
-    </w:p>
-    <w:p>
-      <w:pPr>
-        <w:spacing w:line="480" w:lineRule="auto"/>
-        <w:rPr>
-          <w:rFonts w:ascii="Arial" w:eastAsia="Arial" w:hAnsi="Arial" w:cs="Arial"/>
-          <w:b/>
-          <w:sz w:val="20"/>
-          <w:szCs w:val="20"/>
-        </w:rPr>
-      </w:pPr>
-      <w:r>
-        <w:rPr>
-          <w:rFonts w:ascii="Arial" w:eastAsia="Arial" w:hAnsi="Arial" w:cs="Arial"/>
-          <w:b/>
-          <w:sz w:val="20"/>
-          <w:szCs w:val="20"/>
-        </w:rPr>
         <w:t>784. SHERLOCK HOLMES IN THE 22ND CENTURY</w:t>
       </w:r>
     </w:p>
@@ -16972,47 +16944,47 @@
           <w:sz w:val="20"/>
           <w:szCs w:val="20"/>
         </w:rPr>
+        <w:t>814.  FANTASTIC MAX</w:t>
+      </w:r>
+    </w:p>
+    <w:p>
+      <w:pPr>
+        <w:spacing w:line="480" w:lineRule="auto"/>
+        <w:rPr>
+          <w:rFonts w:ascii="Arial" w:eastAsia="Arial" w:hAnsi="Arial" w:cs="Arial"/>
+          <w:b/>
+          <w:sz w:val="20"/>
+          <w:szCs w:val="20"/>
+        </w:rPr>
+      </w:pPr>
+      <w:r>
+        <w:rPr>
+          <w:rFonts w:ascii="Arial" w:eastAsia="Arial" w:hAnsi="Arial" w:cs="Arial"/>
+          <w:b/>
+          <w:sz w:val="20"/>
+          <w:szCs w:val="20"/>
+        </w:rPr>
+        <w:t>815. DISNEY’S CHRISTMAS FAVOURITES</w:t>
+      </w:r>
+    </w:p>
+    <w:p>
+      <w:pPr>
+        <w:spacing w:line="480" w:lineRule="auto"/>
+        <w:rPr>
+          <w:rFonts w:ascii="Arial" w:eastAsia="Arial" w:hAnsi="Arial" w:cs="Arial"/>
+          <w:b/>
+          <w:sz w:val="20"/>
+          <w:szCs w:val="20"/>
+        </w:rPr>
+      </w:pPr>
+      <w:r>
+        <w:rPr>
+          <w:rFonts w:ascii="Arial" w:eastAsia="Arial" w:hAnsi="Arial" w:cs="Arial"/>
+          <w:b/>
+          <w:sz w:val="20"/>
+          <w:szCs w:val="20"/>
+        </w:rPr>
         <w:lastRenderedPageBreak/>
-        <w:t>814.  FANTASTIC MAX</w:t>
-      </w:r>
-    </w:p>
-    <w:p>
-      <w:pPr>
-        <w:spacing w:line="480" w:lineRule="auto"/>
-        <w:rPr>
-          <w:rFonts w:ascii="Arial" w:eastAsia="Arial" w:hAnsi="Arial" w:cs="Arial"/>
-          <w:b/>
-          <w:sz w:val="20"/>
-          <w:szCs w:val="20"/>
-        </w:rPr>
-      </w:pPr>
-      <w:r>
-        <w:rPr>
-          <w:rFonts w:ascii="Arial" w:eastAsia="Arial" w:hAnsi="Arial" w:cs="Arial"/>
-          <w:b/>
-          <w:sz w:val="20"/>
-          <w:szCs w:val="20"/>
-        </w:rPr>
-        <w:t>815. DISNEY’S CHRISTMAS FAVOURITES</w:t>
-      </w:r>
-    </w:p>
-    <w:p>
-      <w:pPr>
-        <w:spacing w:line="480" w:lineRule="auto"/>
-        <w:rPr>
-          <w:rFonts w:ascii="Arial" w:eastAsia="Arial" w:hAnsi="Arial" w:cs="Arial"/>
-          <w:b/>
-          <w:sz w:val="20"/>
-          <w:szCs w:val="20"/>
-        </w:rPr>
-      </w:pPr>
-      <w:r>
-        <w:rPr>
-          <w:rFonts w:ascii="Arial" w:eastAsia="Arial" w:hAnsi="Arial" w:cs="Arial"/>
-          <w:b/>
-          <w:sz w:val="20"/>
-          <w:szCs w:val="20"/>
-        </w:rPr>
         <w:t>816. ALADDIN THE COMPLETE SERIES</w:t>
       </w:r>
     </w:p>
@@ -17613,47 +17585,47 @@
           <w:sz w:val="20"/>
           <w:szCs w:val="20"/>
         </w:rPr>
+        <w:t>846. CREEPY CRAWLERS</w:t>
+      </w:r>
+    </w:p>
+    <w:p>
+      <w:pPr>
+        <w:spacing w:line="480" w:lineRule="auto"/>
+        <w:rPr>
+          <w:rFonts w:ascii="Arial" w:eastAsia="Arial" w:hAnsi="Arial" w:cs="Arial"/>
+          <w:b/>
+          <w:sz w:val="20"/>
+          <w:szCs w:val="20"/>
+        </w:rPr>
+      </w:pPr>
+      <w:r>
+        <w:rPr>
+          <w:rFonts w:ascii="Arial" w:eastAsia="Arial" w:hAnsi="Arial" w:cs="Arial"/>
+          <w:b/>
+          <w:sz w:val="20"/>
+          <w:szCs w:val="20"/>
+        </w:rPr>
+        <w:t>847. CRO</w:t>
+      </w:r>
+    </w:p>
+    <w:p>
+      <w:pPr>
+        <w:spacing w:line="480" w:lineRule="auto"/>
+        <w:rPr>
+          <w:rFonts w:ascii="Arial" w:eastAsia="Arial" w:hAnsi="Arial" w:cs="Arial"/>
+          <w:b/>
+          <w:sz w:val="20"/>
+          <w:szCs w:val="20"/>
+        </w:rPr>
+      </w:pPr>
+      <w:r>
+        <w:rPr>
+          <w:rFonts w:ascii="Arial" w:eastAsia="Arial" w:hAnsi="Arial" w:cs="Arial"/>
+          <w:b/>
+          <w:sz w:val="20"/>
+          <w:szCs w:val="20"/>
+        </w:rPr>
         <w:lastRenderedPageBreak/>
-        <w:t>846. CREEPY CRAWLERS</w:t>
-      </w:r>
-    </w:p>
-    <w:p>
-      <w:pPr>
-        <w:spacing w:line="480" w:lineRule="auto"/>
-        <w:rPr>
-          <w:rFonts w:ascii="Arial" w:eastAsia="Arial" w:hAnsi="Arial" w:cs="Arial"/>
-          <w:b/>
-          <w:sz w:val="20"/>
-          <w:szCs w:val="20"/>
-        </w:rPr>
-      </w:pPr>
-      <w:r>
-        <w:rPr>
-          <w:rFonts w:ascii="Arial" w:eastAsia="Arial" w:hAnsi="Arial" w:cs="Arial"/>
-          <w:b/>
-          <w:sz w:val="20"/>
-          <w:szCs w:val="20"/>
-        </w:rPr>
-        <w:t>847. CRO</w:t>
-      </w:r>
-    </w:p>
-    <w:p>
-      <w:pPr>
-        <w:spacing w:line="480" w:lineRule="auto"/>
-        <w:rPr>
-          <w:rFonts w:ascii="Arial" w:eastAsia="Arial" w:hAnsi="Arial" w:cs="Arial"/>
-          <w:b/>
-          <w:sz w:val="20"/>
-          <w:szCs w:val="20"/>
-        </w:rPr>
-      </w:pPr>
-      <w:r>
-        <w:rPr>
-          <w:rFonts w:ascii="Arial" w:eastAsia="Arial" w:hAnsi="Arial" w:cs="Arial"/>
-          <w:b/>
-          <w:sz w:val="20"/>
-          <w:szCs w:val="20"/>
-        </w:rPr>
         <w:t>848. DENNIS THE MENACE</w:t>
       </w:r>
     </w:p>
@@ -18244,47 +18216,47 @@
           <w:sz w:val="20"/>
           <w:szCs w:val="20"/>
         </w:rPr>
+        <w:t>878. GOLDEN FILMS THE WIZARD OF OZ &amp; SNOW WHITE AND THE SEVEN DWARFS</w:t>
+      </w:r>
+    </w:p>
+    <w:p>
+      <w:pPr>
+        <w:spacing w:line="480" w:lineRule="auto"/>
+        <w:rPr>
+          <w:rFonts w:ascii="Arial" w:eastAsia="Arial" w:hAnsi="Arial" w:cs="Arial"/>
+          <w:b/>
+          <w:sz w:val="20"/>
+          <w:szCs w:val="20"/>
+        </w:rPr>
+      </w:pPr>
+      <w:r>
+        <w:rPr>
+          <w:rFonts w:ascii="Arial" w:eastAsia="Arial" w:hAnsi="Arial" w:cs="Arial"/>
+          <w:b/>
+          <w:sz w:val="20"/>
+          <w:szCs w:val="20"/>
+        </w:rPr>
+        <w:t>879. YOUNG POCAHONTAS</w:t>
+      </w:r>
+    </w:p>
+    <w:p>
+      <w:pPr>
+        <w:spacing w:line="480" w:lineRule="auto"/>
+        <w:rPr>
+          <w:rFonts w:ascii="Arial" w:eastAsia="Arial" w:hAnsi="Arial" w:cs="Arial"/>
+          <w:b/>
+          <w:sz w:val="20"/>
+          <w:szCs w:val="20"/>
+        </w:rPr>
+      </w:pPr>
+      <w:r>
+        <w:rPr>
+          <w:rFonts w:ascii="Arial" w:eastAsia="Arial" w:hAnsi="Arial" w:cs="Arial"/>
+          <w:b/>
+          <w:sz w:val="20"/>
+          <w:szCs w:val="20"/>
+        </w:rPr>
         <w:lastRenderedPageBreak/>
-        <w:t>878. GOLDEN FILMS THE WIZARD OF OZ &amp; SNOW WHITE AND THE SEVEN DWARFS</w:t>
-      </w:r>
-    </w:p>
-    <w:p>
-      <w:pPr>
-        <w:spacing w:line="480" w:lineRule="auto"/>
-        <w:rPr>
-          <w:rFonts w:ascii="Arial" w:eastAsia="Arial" w:hAnsi="Arial" w:cs="Arial"/>
-          <w:b/>
-          <w:sz w:val="20"/>
-          <w:szCs w:val="20"/>
-        </w:rPr>
-      </w:pPr>
-      <w:r>
-        <w:rPr>
-          <w:rFonts w:ascii="Arial" w:eastAsia="Arial" w:hAnsi="Arial" w:cs="Arial"/>
-          <w:b/>
-          <w:sz w:val="20"/>
-          <w:szCs w:val="20"/>
-        </w:rPr>
-        <w:t>879. YOUNG POCAHONTAS</w:t>
-      </w:r>
-    </w:p>
-    <w:p>
-      <w:pPr>
-        <w:spacing w:line="480" w:lineRule="auto"/>
-        <w:rPr>
-          <w:rFonts w:ascii="Arial" w:eastAsia="Arial" w:hAnsi="Arial" w:cs="Arial"/>
-          <w:b/>
-          <w:sz w:val="20"/>
-          <w:szCs w:val="20"/>
-        </w:rPr>
-      </w:pPr>
-      <w:r>
-        <w:rPr>
-          <w:rFonts w:ascii="Arial" w:eastAsia="Arial" w:hAnsi="Arial" w:cs="Arial"/>
-          <w:b/>
-          <w:sz w:val="20"/>
-          <w:szCs w:val="20"/>
-        </w:rPr>
         <w:t>880. THE ADVENTURES OF TEDDY RUXPIN</w:t>
       </w:r>
     </w:p>
@@ -18903,47 +18875,47 @@
           <w:sz w:val="20"/>
           <w:szCs w:val="20"/>
         </w:rPr>
+        <w:t>910. BRAMBLY HEDGE</w:t>
+      </w:r>
+    </w:p>
+    <w:p>
+      <w:pPr>
+        <w:spacing w:line="480" w:lineRule="auto"/>
+        <w:rPr>
+          <w:rFonts w:ascii="Arial" w:eastAsia="Arial" w:hAnsi="Arial" w:cs="Arial"/>
+          <w:b/>
+          <w:sz w:val="20"/>
+          <w:szCs w:val="20"/>
+        </w:rPr>
+      </w:pPr>
+      <w:r>
+        <w:rPr>
+          <w:rFonts w:ascii="Arial" w:eastAsia="Arial" w:hAnsi="Arial" w:cs="Arial"/>
+          <w:b/>
+          <w:sz w:val="20"/>
+          <w:szCs w:val="20"/>
+        </w:rPr>
+        <w:t>911. DETENTION</w:t>
+      </w:r>
+    </w:p>
+    <w:p>
+      <w:pPr>
+        <w:spacing w:line="480" w:lineRule="auto"/>
+        <w:rPr>
+          <w:rFonts w:ascii="Arial" w:eastAsia="Arial" w:hAnsi="Arial" w:cs="Arial"/>
+          <w:b/>
+          <w:sz w:val="20"/>
+          <w:szCs w:val="20"/>
+        </w:rPr>
+      </w:pPr>
+      <w:r>
+        <w:rPr>
+          <w:rFonts w:ascii="Arial" w:eastAsia="Arial" w:hAnsi="Arial" w:cs="Arial"/>
+          <w:b/>
+          <w:sz w:val="20"/>
+          <w:szCs w:val="20"/>
+        </w:rPr>
         <w:lastRenderedPageBreak/>
-        <w:t>910. BRAMBLY HEDGE</w:t>
-      </w:r>
-    </w:p>
-    <w:p>
-      <w:pPr>
-        <w:spacing w:line="480" w:lineRule="auto"/>
-        <w:rPr>
-          <w:rFonts w:ascii="Arial" w:eastAsia="Arial" w:hAnsi="Arial" w:cs="Arial"/>
-          <w:b/>
-          <w:sz w:val="20"/>
-          <w:szCs w:val="20"/>
-        </w:rPr>
-      </w:pPr>
-      <w:r>
-        <w:rPr>
-          <w:rFonts w:ascii="Arial" w:eastAsia="Arial" w:hAnsi="Arial" w:cs="Arial"/>
-          <w:b/>
-          <w:sz w:val="20"/>
-          <w:szCs w:val="20"/>
-        </w:rPr>
-        <w:t>911. DETENTION</w:t>
-      </w:r>
-    </w:p>
-    <w:p>
-      <w:pPr>
-        <w:spacing w:line="480" w:lineRule="auto"/>
-        <w:rPr>
-          <w:rFonts w:ascii="Arial" w:eastAsia="Arial" w:hAnsi="Arial" w:cs="Arial"/>
-          <w:b/>
-          <w:sz w:val="20"/>
-          <w:szCs w:val="20"/>
-        </w:rPr>
-      </w:pPr>
-      <w:r>
-        <w:rPr>
-          <w:rFonts w:ascii="Arial" w:eastAsia="Arial" w:hAnsi="Arial" w:cs="Arial"/>
-          <w:b/>
-          <w:sz w:val="20"/>
-          <w:szCs w:val="20"/>
-        </w:rPr>
         <w:t>912. DOUG</w:t>
       </w:r>
     </w:p>
@@ -19534,47 +19506,47 @@
           <w:sz w:val="20"/>
           <w:szCs w:val="20"/>
         </w:rPr>
+        <w:t>941. SABAN’S AROUND THE WORLD IN 80 DREAMS</w:t>
+      </w:r>
+    </w:p>
+    <w:p>
+      <w:pPr>
+        <w:spacing w:line="480" w:lineRule="auto"/>
+        <w:rPr>
+          <w:rFonts w:ascii="Arial" w:eastAsia="Arial" w:hAnsi="Arial" w:cs="Arial"/>
+          <w:b/>
+          <w:sz w:val="20"/>
+          <w:szCs w:val="20"/>
+        </w:rPr>
+      </w:pPr>
+      <w:r>
+        <w:rPr>
+          <w:rFonts w:ascii="Arial" w:eastAsia="Arial" w:hAnsi="Arial" w:cs="Arial"/>
+          <w:b/>
+          <w:sz w:val="20"/>
+          <w:szCs w:val="20"/>
+        </w:rPr>
+        <w:t>942. SABAN’S GULLIVER’S TRAVELS</w:t>
+      </w:r>
+    </w:p>
+    <w:p>
+      <w:pPr>
+        <w:spacing w:line="480" w:lineRule="auto"/>
+        <w:rPr>
+          <w:rFonts w:ascii="Arial" w:eastAsia="Arial" w:hAnsi="Arial" w:cs="Arial"/>
+          <w:b/>
+          <w:sz w:val="20"/>
+          <w:szCs w:val="20"/>
+        </w:rPr>
+      </w:pPr>
+      <w:r>
+        <w:rPr>
+          <w:rFonts w:ascii="Arial" w:eastAsia="Arial" w:hAnsi="Arial" w:cs="Arial"/>
+          <w:b/>
+          <w:sz w:val="20"/>
+          <w:szCs w:val="20"/>
+        </w:rPr>
         <w:lastRenderedPageBreak/>
-        <w:t>941. SABAN’S AROUND THE WORLD IN 80 DREAMS</w:t>
-      </w:r>
-    </w:p>
-    <w:p>
-      <w:pPr>
-        <w:spacing w:line="480" w:lineRule="auto"/>
-        <w:rPr>
-          <w:rFonts w:ascii="Arial" w:eastAsia="Arial" w:hAnsi="Arial" w:cs="Arial"/>
-          <w:b/>
-          <w:sz w:val="20"/>
-          <w:szCs w:val="20"/>
-        </w:rPr>
-      </w:pPr>
-      <w:r>
-        <w:rPr>
-          <w:rFonts w:ascii="Arial" w:eastAsia="Arial" w:hAnsi="Arial" w:cs="Arial"/>
-          <w:b/>
-          <w:sz w:val="20"/>
-          <w:szCs w:val="20"/>
-        </w:rPr>
-        <w:t>942. SABAN’S GULLIVER’S TRAVELS</w:t>
-      </w:r>
-    </w:p>
-    <w:p>
-      <w:pPr>
-        <w:spacing w:line="480" w:lineRule="auto"/>
-        <w:rPr>
-          <w:rFonts w:ascii="Arial" w:eastAsia="Arial" w:hAnsi="Arial" w:cs="Arial"/>
-          <w:b/>
-          <w:sz w:val="20"/>
-          <w:szCs w:val="20"/>
-        </w:rPr>
-      </w:pPr>
-      <w:r>
-        <w:rPr>
-          <w:rFonts w:ascii="Arial" w:eastAsia="Arial" w:hAnsi="Arial" w:cs="Arial"/>
-          <w:b/>
-          <w:sz w:val="20"/>
-          <w:szCs w:val="20"/>
-        </w:rPr>
         <w:t>943. THE SAVAGE DRAGON</w:t>
       </w:r>
     </w:p>
@@ -20676,6 +20648,7 @@
   <w:style w:type="character" w:default="1" w:styleId="DefaultParagraphFont">
     <w:name w:val="Default Paragraph Font"/>
     <w:uiPriority w:val="1"/>
+    <w:semiHidden/>
     <w:unhideWhenUsed/>
   </w:style>
   <w:style w:type="table" w:default="1" w:styleId="TableNormal">

</xml_diff>